<commit_message>
feat(access): finish server gates, retire legacy editors, and document completion
Apply role-definition and finance capability SQL, collapse remaining access UIs into the Users workspace, harden manifest navigation denials, and record verification evidence in the access audit.

Co-authored-by: Cursor <cursoragent@cursor.com>
</commit_message>
<xml_diff>
--- a/docs/PACT_Role_Page_Sidebar_Access_Audit.docx
+++ b/docs/PACT_Role_Page_Sidebar_Access_Audit.docx
@@ -7728,6 +7728,16 @@
       <w:cols w:space="720"/>
       <w:docGrid w:linePitch="360"/>
     </w:sectPr>
+    <w:p>
+      <w:r>
+        <w:t>Completion evidence — 16 September 2026</w:t>
+      </w:r>
+    </w:p>
+    <w:p>
+      <w:r>
+        <w:t>Server authorization migrations through finance capability gates are applied and verified. Legacy access editors are retired into the canonical Users / Access Control Workspace. TypeScript is clean and the access matrix Vitest suites passed 258 tests. See docs/PACT_Role_Page_Sidebar_Access_Audit_Completion.md for the full evidence table.</w:t>
+      </w:r>
+    </w:p>
   </w:body>
 </w:document>
 </file>

</xml_diff>